<commit_message>
Added moodle install notes
</commit_message>
<xml_diff>
--- a/static/files/EricMPastore_CV_2026.docx
+++ b/static/files/EricMPastore_CV_2026.docx
@@ -213,6 +213,83 @@
         </w:numPr>
       </w:pPr>
       <w:r>
+        <w:t>HTML5/CSS3</w:t>
+      </w:r>
+    </w:p>
+    <w:p>
+      <w:pPr>
+        <w:pStyle w:val="ListParagraph"/>
+        <w:numPr>
+          <w:ilvl w:val="0"/>
+          <w:numId w:val="4"/>
+        </w:numPr>
+      </w:pPr>
+      <w:proofErr w:type="spellStart"/>
+      <w:r>
+        <w:t>Javascript</w:t>
+      </w:r>
+      <w:proofErr w:type="spellEnd"/>
+      <w:r>
+        <w:t>, Node.js</w:t>
+      </w:r>
+    </w:p>
+    <w:p>
+      <w:pPr>
+        <w:pStyle w:val="ListParagraph"/>
+        <w:numPr>
+          <w:ilvl w:val="0"/>
+          <w:numId w:val="4"/>
+        </w:numPr>
+      </w:pPr>
+      <w:r>
+        <w:t>RHEL OS</w:t>
+      </w:r>
+    </w:p>
+    <w:p>
+      <w:pPr>
+        <w:pStyle w:val="ListParagraph"/>
+        <w:numPr>
+          <w:ilvl w:val="0"/>
+          <w:numId w:val="4"/>
+        </w:numPr>
+      </w:pPr>
+      <w:r>
+        <w:t>Ubuntu Linux</w:t>
+      </w:r>
+    </w:p>
+    <w:p>
+      <w:pPr>
+        <w:pStyle w:val="ListParagraph"/>
+        <w:numPr>
+          <w:ilvl w:val="0"/>
+          <w:numId w:val="4"/>
+        </w:numPr>
+      </w:pPr>
+      <w:r>
+        <w:t>Bash Scripting</w:t>
+      </w:r>
+    </w:p>
+    <w:p>
+      <w:pPr>
+        <w:pStyle w:val="ListParagraph"/>
+        <w:numPr>
+          <w:ilvl w:val="0"/>
+          <w:numId w:val="4"/>
+        </w:numPr>
+      </w:pPr>
+      <w:r>
+        <w:t>PowerShell Scripting</w:t>
+      </w:r>
+    </w:p>
+    <w:p>
+      <w:pPr>
+        <w:pStyle w:val="ListParagraph"/>
+        <w:numPr>
+          <w:ilvl w:val="0"/>
+          <w:numId w:val="4"/>
+        </w:numPr>
+      </w:pPr>
+      <w:r>
         <w:t>CompTIA Security+</w:t>
       </w:r>
     </w:p>
@@ -368,25 +445,7 @@
           <w:sz w:val="20"/>
           <w:szCs w:val="20"/>
         </w:rPr>
-        <w:t xml:space="preserve">elivered Tableau Desktop I and II training to 80+ employees of major banking </w:t>
-      </w:r>
-      <w:proofErr w:type="gramStart"/>
-      <w:r>
-        <w:rPr>
-          <w:rFonts w:asciiTheme="minorHAnsi" w:hAnsiTheme="minorHAnsi" w:cstheme="majorHAnsi"/>
-          <w:sz w:val="20"/>
-          <w:szCs w:val="20"/>
-        </w:rPr>
-        <w:t>client</w:t>
-      </w:r>
-      <w:proofErr w:type="gramEnd"/>
-      <w:r>
-        <w:rPr>
-          <w:rFonts w:asciiTheme="minorHAnsi" w:hAnsiTheme="minorHAnsi" w:cstheme="majorHAnsi"/>
-          <w:sz w:val="20"/>
-          <w:szCs w:val="20"/>
-        </w:rPr>
-        <w:t xml:space="preserve"> both domestic and overseas</w:t>
+        <w:t>elivered Tableau Desktop I and II training to 80+ employees of major banking client both domestic and overseas</w:t>
       </w:r>
     </w:p>
     <w:p>
@@ -1007,23 +1066,95 @@
           <w:sz w:val="20"/>
           <w:szCs w:val="20"/>
         </w:rPr>
-        <w:t xml:space="preserve">Ensure information assurance and </w:t>
-      </w:r>
-      <w:r>
-        <w:rPr>
-          <w:rFonts w:asciiTheme="minorHAnsi" w:hAnsiTheme="minorHAnsi" w:cstheme="majorHAnsi"/>
-          <w:sz w:val="20"/>
-          <w:szCs w:val="20"/>
-        </w:rPr>
-        <w:t xml:space="preserve">data </w:t>
-      </w:r>
-      <w:r>
-        <w:rPr>
-          <w:rFonts w:asciiTheme="minorHAnsi" w:hAnsiTheme="minorHAnsi" w:cstheme="majorHAnsi"/>
-          <w:sz w:val="20"/>
-          <w:szCs w:val="20"/>
-        </w:rPr>
-        <w:t>security through compliance with Risk Management Framework (RMF)</w:t>
+        <w:t xml:space="preserve">Generated vulnerability management report for 400+ hosts using </w:t>
+      </w:r>
+      <w:r>
+        <w:rPr>
+          <w:rFonts w:asciiTheme="minorHAnsi" w:hAnsiTheme="minorHAnsi" w:cstheme="majorHAnsi"/>
+          <w:sz w:val="20"/>
+          <w:szCs w:val="20"/>
+        </w:rPr>
+        <w:t xml:space="preserve">Nessus for scanning and PowerShell to automatically retrieve host names via </w:t>
+      </w:r>
+      <w:proofErr w:type="spellStart"/>
+      <w:r>
+        <w:rPr>
+          <w:rFonts w:asciiTheme="minorHAnsi" w:hAnsiTheme="minorHAnsi" w:cstheme="majorHAnsi"/>
+          <w:sz w:val="20"/>
+          <w:szCs w:val="20"/>
+        </w:rPr>
+        <w:t>nslookup</w:t>
+      </w:r>
+      <w:proofErr w:type="spellEnd"/>
+      <w:r>
+        <w:rPr>
+          <w:rFonts w:asciiTheme="minorHAnsi" w:hAnsiTheme="minorHAnsi" w:cstheme="majorHAnsi"/>
+          <w:sz w:val="20"/>
+          <w:szCs w:val="20"/>
+        </w:rPr>
+        <w:t xml:space="preserve">, leading to </w:t>
+      </w:r>
+      <w:r>
+        <w:rPr>
+          <w:rFonts w:asciiTheme="minorHAnsi" w:hAnsiTheme="minorHAnsi" w:cstheme="majorHAnsi"/>
+          <w:sz w:val="20"/>
+          <w:szCs w:val="20"/>
+        </w:rPr>
+        <w:t>critical patches being installed on 200+ hosts</w:t>
+      </w:r>
+    </w:p>
+    <w:p>
+      <w:pPr>
+        <w:pStyle w:val="BodyText"/>
+        <w:numPr>
+          <w:ilvl w:val="0"/>
+          <w:numId w:val="5"/>
+        </w:numPr>
+        <w:rPr>
+          <w:rFonts w:asciiTheme="minorHAnsi" w:hAnsiTheme="minorHAnsi" w:cstheme="majorHAnsi"/>
+          <w:sz w:val="20"/>
+          <w:szCs w:val="20"/>
+        </w:rPr>
+      </w:pPr>
+      <w:r>
+        <w:rPr>
+          <w:rFonts w:asciiTheme="minorHAnsi" w:hAnsiTheme="minorHAnsi" w:cstheme="majorHAnsi"/>
+          <w:sz w:val="20"/>
+          <w:szCs w:val="20"/>
+        </w:rPr>
+        <w:t>Closed 6 audit finding</w:t>
+      </w:r>
+      <w:r>
+        <w:rPr>
+          <w:rFonts w:asciiTheme="minorHAnsi" w:hAnsiTheme="minorHAnsi" w:cstheme="majorHAnsi"/>
+          <w:sz w:val="20"/>
+          <w:szCs w:val="20"/>
+        </w:rPr>
+        <w:t>s</w:t>
+      </w:r>
+      <w:r>
+        <w:rPr>
+          <w:rFonts w:asciiTheme="minorHAnsi" w:hAnsiTheme="minorHAnsi" w:cstheme="majorHAnsi"/>
+          <w:sz w:val="20"/>
+          <w:szCs w:val="20"/>
+        </w:rPr>
+        <w:t xml:space="preserve"> through updating </w:t>
+      </w:r>
+      <w:r>
+        <w:rPr>
+          <w:rFonts w:asciiTheme="minorHAnsi" w:hAnsiTheme="minorHAnsi" w:cstheme="majorHAnsi"/>
+          <w:sz w:val="20"/>
+          <w:szCs w:val="20"/>
+        </w:rPr>
+        <w:t xml:space="preserve">policies in compliance with </w:t>
+      </w:r>
+      <w:r>
+        <w:rPr>
+          <w:rFonts w:asciiTheme="minorHAnsi" w:hAnsiTheme="minorHAnsi" w:cstheme="majorHAnsi"/>
+          <w:sz w:val="20"/>
+          <w:szCs w:val="20"/>
+        </w:rPr>
+        <w:t xml:space="preserve"> Risk Management Framework (RMF)</w:t>
       </w:r>
     </w:p>
     <w:p>
@@ -1246,25 +1377,7 @@
           <w:sz w:val="20"/>
           <w:szCs w:val="20"/>
         </w:rPr>
-        <w:t xml:space="preserve">Cut downtime reporting delays from days to hours and improved asset </w:t>
-      </w:r>
-      <w:proofErr w:type="gramStart"/>
-      <w:r>
-        <w:rPr>
-          <w:rFonts w:asciiTheme="minorHAnsi" w:hAnsiTheme="minorHAnsi" w:cstheme="majorHAnsi"/>
-          <w:sz w:val="20"/>
-          <w:szCs w:val="20"/>
-        </w:rPr>
-        <w:t>uptime</w:t>
-      </w:r>
-      <w:proofErr w:type="gramEnd"/>
-      <w:r>
-        <w:rPr>
-          <w:rFonts w:asciiTheme="minorHAnsi" w:hAnsiTheme="minorHAnsi" w:cstheme="majorHAnsi"/>
-          <w:sz w:val="20"/>
-          <w:szCs w:val="20"/>
-        </w:rPr>
-        <w:t xml:space="preserve"> by 15% for an air delivery client</w:t>
+        <w:t>Cut downtime reporting delays from days to hours and improved asset uptime by 15% for an air delivery client</w:t>
       </w:r>
     </w:p>
     <w:p>
@@ -1664,6 +1777,8 @@
         <w:ind w:left="0"/>
         <w:rPr>
           <w:rFonts w:asciiTheme="majorHAnsi" w:hAnsiTheme="majorHAnsi" w:cstheme="majorHAnsi"/>
+          <w:b/>
+          <w:bCs/>
           <w:sz w:val="22"/>
           <w:szCs w:val="22"/>
         </w:rPr>
@@ -1697,6 +1812,152 @@
           <w:szCs w:val="22"/>
         </w:rPr>
         <w:t>RIT, Rochester, NY, Graduated Dec. 2015</w:t>
+      </w:r>
+    </w:p>
+    <w:p>
+      <w:pPr>
+        <w:pStyle w:val="BodyText"/>
+        <w:tabs>
+          <w:tab w:val="left" w:pos="90"/>
+        </w:tabs>
+        <w:spacing w:before="46"/>
+        <w:ind w:left="0"/>
+        <w:rPr>
+          <w:rFonts w:asciiTheme="majorHAnsi" w:hAnsiTheme="majorHAnsi" w:cstheme="majorHAnsi"/>
+          <w:b/>
+          <w:bCs/>
+          <w:sz w:val="22"/>
+          <w:szCs w:val="22"/>
+        </w:rPr>
+      </w:pPr>
+      <w:r>
+        <w:rPr>
+          <w:rFonts w:asciiTheme="majorHAnsi" w:hAnsiTheme="majorHAnsi" w:cstheme="majorHAnsi"/>
+          <w:b/>
+          <w:bCs/>
+          <w:sz w:val="22"/>
+          <w:szCs w:val="22"/>
+        </w:rPr>
+        <w:t>Relevant Courses:</w:t>
+      </w:r>
+    </w:p>
+    <w:p>
+      <w:pPr>
+        <w:pStyle w:val="BodyText"/>
+        <w:tabs>
+          <w:tab w:val="left" w:pos="90"/>
+        </w:tabs>
+        <w:spacing w:before="46"/>
+        <w:ind w:left="0"/>
+        <w:rPr>
+          <w:rFonts w:asciiTheme="majorHAnsi" w:hAnsiTheme="majorHAnsi" w:cstheme="majorHAnsi"/>
+          <w:b/>
+          <w:bCs/>
+          <w:sz w:val="22"/>
+          <w:szCs w:val="22"/>
+        </w:rPr>
+      </w:pPr>
+      <w:r>
+        <w:rPr>
+          <w:rFonts w:asciiTheme="majorHAnsi" w:hAnsiTheme="majorHAnsi" w:cstheme="majorHAnsi"/>
+          <w:b/>
+          <w:bCs/>
+          <w:sz w:val="22"/>
+          <w:szCs w:val="22"/>
+        </w:rPr>
+        <w:t>Fundamentals of Web-Based Multimedia:</w:t>
+      </w:r>
+    </w:p>
+    <w:p>
+      <w:pPr>
+        <w:pStyle w:val="BodyText"/>
+        <w:numPr>
+          <w:ilvl w:val="0"/>
+          <w:numId w:val="14"/>
+        </w:numPr>
+        <w:tabs>
+          <w:tab w:val="left" w:pos="90"/>
+        </w:tabs>
+        <w:spacing w:before="46"/>
+        <w:rPr>
+          <w:rFonts w:asciiTheme="majorHAnsi" w:hAnsiTheme="majorHAnsi" w:cstheme="majorHAnsi"/>
+          <w:sz w:val="22"/>
+          <w:szCs w:val="22"/>
+        </w:rPr>
+      </w:pPr>
+      <w:r>
+        <w:rPr>
+          <w:rFonts w:asciiTheme="majorHAnsi" w:hAnsiTheme="majorHAnsi" w:cstheme="majorHAnsi"/>
+          <w:sz w:val="22"/>
+          <w:szCs w:val="22"/>
+        </w:rPr>
+        <w:t xml:space="preserve">Developed HTML5/CSS3 </w:t>
+      </w:r>
+      <w:r>
+        <w:rPr>
+          <w:rFonts w:asciiTheme="majorHAnsi" w:hAnsiTheme="majorHAnsi" w:cstheme="majorHAnsi"/>
+          <w:sz w:val="22"/>
+          <w:szCs w:val="22"/>
+        </w:rPr>
+        <w:t>e-learning utilizing HTML5/CSS3 architecture</w:t>
+      </w:r>
+      <w:r>
+        <w:rPr>
+          <w:rFonts w:asciiTheme="majorHAnsi" w:hAnsiTheme="majorHAnsi" w:cstheme="majorHAnsi"/>
+          <w:sz w:val="22"/>
+          <w:szCs w:val="22"/>
+        </w:rPr>
+        <w:t xml:space="preserve">, then leveraged </w:t>
+      </w:r>
+      <w:r>
+        <w:rPr>
+          <w:rFonts w:asciiTheme="majorHAnsi" w:hAnsiTheme="majorHAnsi" w:cstheme="majorHAnsi"/>
+          <w:sz w:val="22"/>
+          <w:szCs w:val="22"/>
+        </w:rPr>
+        <w:t>the lessons learned to incorporate HTML5 architecture into personal website</w:t>
+      </w:r>
+    </w:p>
+    <w:p>
+      <w:pPr>
+        <w:pStyle w:val="BodyText"/>
+        <w:numPr>
+          <w:ilvl w:val="0"/>
+          <w:numId w:val="14"/>
+        </w:numPr>
+        <w:tabs>
+          <w:tab w:val="left" w:pos="90"/>
+        </w:tabs>
+        <w:spacing w:before="46"/>
+        <w:rPr>
+          <w:rFonts w:asciiTheme="majorHAnsi" w:hAnsiTheme="majorHAnsi" w:cstheme="majorHAnsi"/>
+          <w:sz w:val="22"/>
+          <w:szCs w:val="22"/>
+        </w:rPr>
+      </w:pPr>
+      <w:r>
+        <w:rPr>
+          <w:rFonts w:asciiTheme="majorHAnsi" w:hAnsiTheme="majorHAnsi" w:cstheme="majorHAnsi"/>
+          <w:sz w:val="22"/>
+          <w:szCs w:val="22"/>
+        </w:rPr>
+        <w:t xml:space="preserve">Developed personal portfolio site incorporating lessons learned in web design, File Transfer Protocol (FTP), and </w:t>
+      </w:r>
+      <w:r>
+        <w:rPr>
+          <w:rFonts w:asciiTheme="majorHAnsi" w:hAnsiTheme="majorHAnsi" w:cstheme="majorHAnsi"/>
+          <w:sz w:val="22"/>
+          <w:szCs w:val="22"/>
+        </w:rPr>
+        <w:t>Linux permissions using CHMOD.</w:t>
+      </w:r>
+      <w:r>
+        <w:rPr>
+          <w:rFonts w:asciiTheme="majorHAnsi" w:hAnsiTheme="majorHAnsi" w:cstheme="majorHAnsi"/>
+          <w:sz w:val="22"/>
+          <w:szCs w:val="22"/>
+        </w:rPr>
+        <w:t xml:space="preserve"> </w:t>
       </w:r>
     </w:p>
     <w:p>
@@ -2153,21 +2414,21 @@
         <v:path o:extrusionok="f" gradientshapeok="t" o:connecttype="rect"/>
         <o:lock v:ext="edit" aspectratio="t"/>
       </v:shapetype>
-      <v:shape id="_x0000_i1025" type="#_x0000_t75" style="width:28.8pt;height:28.8pt;visibility:visible;mso-wrap-style:square" o:bullet="t">
+      <v:shape id="_x0000_i1025" type="#_x0000_t75" style="width:28.5pt;height:28.5pt;visibility:visible;mso-wrap-style:square" o:bullet="t">
         <v:imagedata r:id="rId1" o:title=""/>
       </v:shape>
     </w:pict>
   </w:numPicBullet>
   <w:numPicBullet w:numPicBulletId="1">
     <w:pict>
-      <v:shape id="_x0000_i1026" type="#_x0000_t75" style="width:28.8pt;height:21.6pt;visibility:visible;mso-wrap-style:square" o:bullet="t">
+      <v:shape id="_x0000_i1026" type="#_x0000_t75" style="width:28.5pt;height:21.75pt;visibility:visible;mso-wrap-style:square" o:bullet="t">
         <v:imagedata r:id="rId2" o:title=""/>
       </v:shape>
     </w:pict>
   </w:numPicBullet>
   <w:numPicBullet w:numPicBulletId="2">
     <w:pict>
-      <v:shape id="_x0000_i1027" type="#_x0000_t75" style="width:28.8pt;height:28.8pt;visibility:visible;mso-wrap-style:square" o:bullet="t">
+      <v:shape id="_x0000_i1027" type="#_x0000_t75" style="width:28.5pt;height:28.5pt;visibility:visible;mso-wrap-style:square" o:bullet="t">
         <v:imagedata r:id="rId3" o:title=""/>
       </v:shape>
     </w:pict>
@@ -2851,6 +3112,119 @@
     </w:lvl>
   </w:abstractNum>
   <w:abstractNum w:abstractNumId="6" w15:restartNumberingAfterBreak="0">
+    <w:nsid w:val="43443D69"/>
+    <w:multiLevelType w:val="hybridMultilevel"/>
+    <w:tmpl w:val="3E327154"/>
+    <w:lvl w:ilvl="0" w:tplc="04090001">
+      <w:start w:val="1"/>
+      <w:numFmt w:val="bullet"/>
+      <w:lvlText w:val=""/>
+      <w:lvlJc w:val="left"/>
+      <w:pPr>
+        <w:ind w:left="450" w:hanging="360"/>
+      </w:pPr>
+      <w:rPr>
+        <w:rFonts w:ascii="Symbol" w:hAnsi="Symbol" w:hint="default"/>
+      </w:rPr>
+    </w:lvl>
+    <w:lvl w:ilvl="1" w:tplc="04090003" w:tentative="1">
+      <w:start w:val="1"/>
+      <w:numFmt w:val="bullet"/>
+      <w:lvlText w:val="o"/>
+      <w:lvlJc w:val="left"/>
+      <w:pPr>
+        <w:ind w:left="1170" w:hanging="360"/>
+      </w:pPr>
+      <w:rPr>
+        <w:rFonts w:ascii="Courier New" w:hAnsi="Courier New" w:cs="Courier New" w:hint="default"/>
+      </w:rPr>
+    </w:lvl>
+    <w:lvl w:ilvl="2" w:tplc="04090005" w:tentative="1">
+      <w:start w:val="1"/>
+      <w:numFmt w:val="bullet"/>
+      <w:lvlText w:val=""/>
+      <w:lvlJc w:val="left"/>
+      <w:pPr>
+        <w:ind w:left="1890" w:hanging="360"/>
+      </w:pPr>
+      <w:rPr>
+        <w:rFonts w:ascii="Wingdings" w:hAnsi="Wingdings" w:hint="default"/>
+      </w:rPr>
+    </w:lvl>
+    <w:lvl w:ilvl="3" w:tplc="04090001" w:tentative="1">
+      <w:start w:val="1"/>
+      <w:numFmt w:val="bullet"/>
+      <w:lvlText w:val=""/>
+      <w:lvlJc w:val="left"/>
+      <w:pPr>
+        <w:ind w:left="2610" w:hanging="360"/>
+      </w:pPr>
+      <w:rPr>
+        <w:rFonts w:ascii="Symbol" w:hAnsi="Symbol" w:hint="default"/>
+      </w:rPr>
+    </w:lvl>
+    <w:lvl w:ilvl="4" w:tplc="04090003" w:tentative="1">
+      <w:start w:val="1"/>
+      <w:numFmt w:val="bullet"/>
+      <w:lvlText w:val="o"/>
+      <w:lvlJc w:val="left"/>
+      <w:pPr>
+        <w:ind w:left="3330" w:hanging="360"/>
+      </w:pPr>
+      <w:rPr>
+        <w:rFonts w:ascii="Courier New" w:hAnsi="Courier New" w:cs="Courier New" w:hint="default"/>
+      </w:rPr>
+    </w:lvl>
+    <w:lvl w:ilvl="5" w:tplc="04090005" w:tentative="1">
+      <w:start w:val="1"/>
+      <w:numFmt w:val="bullet"/>
+      <w:lvlText w:val=""/>
+      <w:lvlJc w:val="left"/>
+      <w:pPr>
+        <w:ind w:left="4050" w:hanging="360"/>
+      </w:pPr>
+      <w:rPr>
+        <w:rFonts w:ascii="Wingdings" w:hAnsi="Wingdings" w:hint="default"/>
+      </w:rPr>
+    </w:lvl>
+    <w:lvl w:ilvl="6" w:tplc="04090001" w:tentative="1">
+      <w:start w:val="1"/>
+      <w:numFmt w:val="bullet"/>
+      <w:lvlText w:val=""/>
+      <w:lvlJc w:val="left"/>
+      <w:pPr>
+        <w:ind w:left="4770" w:hanging="360"/>
+      </w:pPr>
+      <w:rPr>
+        <w:rFonts w:ascii="Symbol" w:hAnsi="Symbol" w:hint="default"/>
+      </w:rPr>
+    </w:lvl>
+    <w:lvl w:ilvl="7" w:tplc="04090003" w:tentative="1">
+      <w:start w:val="1"/>
+      <w:numFmt w:val="bullet"/>
+      <w:lvlText w:val="o"/>
+      <w:lvlJc w:val="left"/>
+      <w:pPr>
+        <w:ind w:left="5490" w:hanging="360"/>
+      </w:pPr>
+      <w:rPr>
+        <w:rFonts w:ascii="Courier New" w:hAnsi="Courier New" w:cs="Courier New" w:hint="default"/>
+      </w:rPr>
+    </w:lvl>
+    <w:lvl w:ilvl="8" w:tplc="04090005" w:tentative="1">
+      <w:start w:val="1"/>
+      <w:numFmt w:val="bullet"/>
+      <w:lvlText w:val=""/>
+      <w:lvlJc w:val="left"/>
+      <w:pPr>
+        <w:ind w:left="6210" w:hanging="360"/>
+      </w:pPr>
+      <w:rPr>
+        <w:rFonts w:ascii="Wingdings" w:hAnsi="Wingdings" w:hint="default"/>
+      </w:rPr>
+    </w:lvl>
+  </w:abstractNum>
+  <w:abstractNum w:abstractNumId="7" w15:restartNumberingAfterBreak="0">
     <w:nsid w:val="43526956"/>
     <w:multiLevelType w:val="hybridMultilevel"/>
     <w:tmpl w:val="B64AB286"/>
@@ -2963,7 +3337,7 @@
       </w:rPr>
     </w:lvl>
   </w:abstractNum>
-  <w:abstractNum w:abstractNumId="7" w15:restartNumberingAfterBreak="0">
+  <w:abstractNum w:abstractNumId="8" w15:restartNumberingAfterBreak="0">
     <w:nsid w:val="4ADF233E"/>
     <w:multiLevelType w:val="hybridMultilevel"/>
     <w:tmpl w:val="2708C590"/>
@@ -3104,7 +3478,7 @@
       </w:rPr>
     </w:lvl>
   </w:abstractNum>
-  <w:abstractNum w:abstractNumId="8" w15:restartNumberingAfterBreak="0">
+  <w:abstractNum w:abstractNumId="9" w15:restartNumberingAfterBreak="0">
     <w:nsid w:val="4B07144D"/>
     <w:multiLevelType w:val="hybridMultilevel"/>
     <w:tmpl w:val="EAB81C62"/>
@@ -3245,7 +3619,7 @@
       </w:rPr>
     </w:lvl>
   </w:abstractNum>
-  <w:abstractNum w:abstractNumId="9" w15:restartNumberingAfterBreak="0">
+  <w:abstractNum w:abstractNumId="10" w15:restartNumberingAfterBreak="0">
     <w:nsid w:val="66103A69"/>
     <w:multiLevelType w:val="hybridMultilevel"/>
     <w:tmpl w:val="1C008D26"/>
@@ -3386,7 +3760,7 @@
       </w:rPr>
     </w:lvl>
   </w:abstractNum>
-  <w:abstractNum w:abstractNumId="10" w15:restartNumberingAfterBreak="0">
+  <w:abstractNum w:abstractNumId="11" w15:restartNumberingAfterBreak="0">
     <w:nsid w:val="6DFB11FB"/>
     <w:multiLevelType w:val="hybridMultilevel"/>
     <w:tmpl w:val="F3E402BC"/>
@@ -3499,7 +3873,7 @@
       </w:rPr>
     </w:lvl>
   </w:abstractNum>
-  <w:abstractNum w:abstractNumId="11" w15:restartNumberingAfterBreak="0">
+  <w:abstractNum w:abstractNumId="12" w15:restartNumberingAfterBreak="0">
     <w:nsid w:val="71AD4A46"/>
     <w:multiLevelType w:val="hybridMultilevel"/>
     <w:tmpl w:val="240A0190"/>
@@ -3612,7 +3986,7 @@
       </w:rPr>
     </w:lvl>
   </w:abstractNum>
-  <w:abstractNum w:abstractNumId="12" w15:restartNumberingAfterBreak="0">
+  <w:abstractNum w:abstractNumId="13" w15:restartNumberingAfterBreak="0">
     <w:nsid w:val="7A1544E8"/>
     <w:multiLevelType w:val="hybridMultilevel"/>
     <w:tmpl w:val="597699B2"/>
@@ -3726,13 +4100,13 @@
     </w:lvl>
   </w:abstractNum>
   <w:num w:numId="1" w16cid:durableId="1575504994">
+    <w:abstractNumId w:val="9"/>
+  </w:num>
+  <w:num w:numId="2" w16cid:durableId="1185971816">
     <w:abstractNumId w:val="8"/>
   </w:num>
-  <w:num w:numId="2" w16cid:durableId="1185971816">
-    <w:abstractNumId w:val="7"/>
-  </w:num>
   <w:num w:numId="3" w16cid:durableId="794645056">
-    <w:abstractNumId w:val="9"/>
+    <w:abstractNumId w:val="10"/>
   </w:num>
   <w:num w:numId="4" w16cid:durableId="1226990196">
     <w:abstractNumId w:val="5"/>
@@ -3744,10 +4118,10 @@
     <w:abstractNumId w:val="1"/>
   </w:num>
   <w:num w:numId="7" w16cid:durableId="1203056523">
-    <w:abstractNumId w:val="12"/>
+    <w:abstractNumId w:val="13"/>
   </w:num>
   <w:num w:numId="8" w16cid:durableId="129903654">
-    <w:abstractNumId w:val="10"/>
+    <w:abstractNumId w:val="11"/>
   </w:num>
   <w:num w:numId="9" w16cid:durableId="133377595">
     <w:abstractNumId w:val="2"/>
@@ -3759,10 +4133,13 @@
     <w:abstractNumId w:val="0"/>
   </w:num>
   <w:num w:numId="12" w16cid:durableId="862137030">
-    <w:abstractNumId w:val="6"/>
+    <w:abstractNumId w:val="7"/>
   </w:num>
   <w:num w:numId="13" w16cid:durableId="1223709911">
-    <w:abstractNumId w:val="11"/>
+    <w:abstractNumId w:val="12"/>
+  </w:num>
+  <w:num w:numId="14" w16cid:durableId="27266166">
+    <w:abstractNumId w:val="6"/>
   </w:num>
 </w:numbering>
 </file>

</xml_diff>